<commit_message>
Subindo ajustes realizados sem commitar
</commit_message>
<xml_diff>
--- a/Documentação/DocumentacaoLuffy.docx
+++ b/Documentação/DocumentacaoLuffy.docx
@@ -51,7 +51,19 @@
         <w:rPr>
           <w:spacing w:val="-2"/>
         </w:rPr>
-        <w:t>LUFFY</w:t>
+        <w:t xml:space="preserve">Monkey D. </w:t>
+      </w:r>
+      <w:r>
+        <w:rPr>
+          <w:spacing w:val="-2"/>
+        </w:rPr>
+        <w:t>L</w:t>
+      </w:r>
+      <w:r>
+        <w:rPr>
+          <w:spacing w:val="-2"/>
+        </w:rPr>
+        <w:t>uffy</w:t>
       </w:r>
     </w:p>
     <w:p>
@@ -429,12 +441,15 @@
       <w:pPr>
         <w:pStyle w:val="Corpodetexto"/>
         <w:spacing w:before="80" w:line="278" w:lineRule="auto"/>
-        <w:ind w:right="21"/>
+        <w:ind w:right="21" w:firstLine="697"/>
         <w:jc w:val="both"/>
       </w:pPr>
       <w:r>
         <w:t>O objetivo do trabalho é apresentar o personagem Luffy, do universo animado de One Piece, demonstrar os motivos de tê-lo escolhido para me representar neste projeto, seus valores e atitudes reagindo a um mundo repleto de injustiças. Suas ações marcadas pela determinação e força de vontade o levam em direção à conquista de ser o maior dos piratas.</w:t>
       </w:r>
+      <w:r>
+        <w:t xml:space="preserve"> Motivar o cliente em acompanhar a jornada do personagem dentro do mundo e conseguir realizar um acompanhamento da sua evolução no decorrer dos episódios.</w:t>
+      </w:r>
     </w:p>
     <w:p>
       <w:pPr>
@@ -478,6 +493,34 @@
       <w:r>
         <w:t>muito bem escrita e adaptada da animação contribui para nos comover pela história do personagem construído ao longo da obra.</w:t>
       </w:r>
+    </w:p>
+    <w:p>
+      <w:pPr>
+        <w:pStyle w:val="Corpodetexto"/>
+        <w:spacing w:before="93"/>
+        <w:ind w:left="0"/>
+      </w:pPr>
+    </w:p>
+    <w:p>
+      <w:pPr>
+        <w:pStyle w:val="Corpodetexto"/>
+        <w:spacing w:before="93"/>
+        <w:ind w:left="0"/>
+      </w:pPr>
+    </w:p>
+    <w:p>
+      <w:pPr>
+        <w:pStyle w:val="Corpodetexto"/>
+        <w:spacing w:before="93"/>
+        <w:ind w:left="0"/>
+      </w:pPr>
+    </w:p>
+    <w:p>
+      <w:pPr>
+        <w:pStyle w:val="Corpodetexto"/>
+        <w:spacing w:before="93"/>
+        <w:ind w:left="0"/>
+      </w:pPr>
     </w:p>
     <w:p>
       <w:pPr>
@@ -504,6 +547,7 @@
           <w:spacing w:val="-2"/>
           <w:sz w:val="24"/>
         </w:rPr>
+        <w:lastRenderedPageBreak/>
         <w:t>Escopo</w:t>
       </w:r>
     </w:p>
@@ -519,12 +563,16 @@
       </w:pPr>
       <w:r>
         <w:rPr>
+          <w:b/>
+          <w:bCs/>
           <w:color w:val="000000" w:themeColor="text1"/>
         </w:rPr>
         <w:t>Descrição</w:t>
       </w:r>
       <w:r>
         <w:rPr>
+          <w:b/>
+          <w:bCs/>
           <w:color w:val="000000" w:themeColor="text1"/>
           <w:spacing w:val="-6"/>
         </w:rPr>
@@ -532,12 +580,16 @@
       </w:r>
       <w:r>
         <w:rPr>
+          <w:b/>
+          <w:bCs/>
           <w:color w:val="000000" w:themeColor="text1"/>
         </w:rPr>
         <w:t>Resumida</w:t>
       </w:r>
       <w:r>
         <w:rPr>
+          <w:b/>
+          <w:bCs/>
           <w:color w:val="000000" w:themeColor="text1"/>
           <w:spacing w:val="-6"/>
         </w:rPr>
@@ -545,12 +597,16 @@
       </w:r>
       <w:r>
         <w:rPr>
+          <w:b/>
+          <w:bCs/>
           <w:color w:val="000000" w:themeColor="text1"/>
         </w:rPr>
         <w:t>do</w:t>
       </w:r>
       <w:r>
         <w:rPr>
+          <w:b/>
+          <w:bCs/>
           <w:color w:val="000000" w:themeColor="text1"/>
           <w:spacing w:val="-6"/>
         </w:rPr>
@@ -558,6 +614,8 @@
       </w:r>
       <w:r>
         <w:rPr>
+          <w:b/>
+          <w:bCs/>
           <w:color w:val="000000" w:themeColor="text1"/>
         </w:rPr>
         <w:t>Projeto:</w:t>
@@ -569,10 +627,21 @@
         </w:rPr>
         <w:t xml:space="preserve"> </w:t>
       </w:r>
-      <w:r>
+    </w:p>
+    <w:p>
+      <w:pPr>
+        <w:pStyle w:val="Corpodetexto"/>
+        <w:spacing w:before="204" w:line="278" w:lineRule="auto"/>
+        <w:ind w:right="16" w:firstLine="697"/>
+        <w:jc w:val="both"/>
         <w:rPr>
           <w:color w:val="000000" w:themeColor="text1"/>
         </w:rPr>
+      </w:pPr>
+      <w:r>
+        <w:rPr>
+          <w:color w:val="000000" w:themeColor="text1"/>
+        </w:rPr>
         <w:t>O projeto aborda todos os pontos relevantes para demonstrar a relação do autor do projeto com o personagem do tema. Aponta diversas situações apresentadas no desenho que são enfrentadas de maneira inspiradora.</w:t>
       </w:r>
     </w:p>
@@ -615,11 +684,22 @@
         <w:t>Resultados Esperados:</w:t>
       </w:r>
       <w:r>
-        <w:t xml:space="preserve"> Espera-se que o projeto demonstre</w:t>
-      </w:r>
-      <w:r>
         <w:t xml:space="preserve"> </w:t>
       </w:r>
+    </w:p>
+    <w:p>
+      <w:pPr>
+        <w:pStyle w:val="Corpodetexto"/>
+        <w:spacing w:line="278" w:lineRule="auto"/>
+        <w:ind w:left="0" w:firstLine="720"/>
+        <w:jc w:val="both"/>
+      </w:pPr>
+      <w:r>
+        <w:t>Espera-se que o projeto demonstre</w:t>
+      </w:r>
+      <w:r>
+        <w:t xml:space="preserve"> </w:t>
+      </w:r>
       <w:r>
         <w:t xml:space="preserve">os motivos que levaram à escolha do personagem Luffy como tema, </w:t>
       </w:r>
@@ -656,7 +736,26 @@
         <w:t>Requisitos do Projeto:</w:t>
       </w:r>
       <w:r>
-        <w:t xml:space="preserve"> Desenvolver um website com formulário de cadastro, tematizado com algo que represente o autor do projeto, utilizando todos os conteúdos aprendidos nas disciplinas de aula, isso inclui Tecnologia da Informação, com documentações e planejamentos; Banco de Dados, usando o Modelo lógico e relacionamentos; Variáveis, funções e operações aprendidas em Algoritmos e Arquitetura Computacional; utilização de uma VM; conceitos de contexto, dashboards e indicadores apresentados em Pesquisa e Inovação. Também será necessário aplicar os conceitos trabalhados nas aulas de Socioemocional. Resultando assim em um projeto integrador com diversos conceitos diferentes sendo aplicados de forma a se complementarem e transmitir o nível de conhecimento aprendido.</w:t>
+        <w:t xml:space="preserve"> </w:t>
+      </w:r>
+    </w:p>
+    <w:p>
+      <w:pPr>
+        <w:pStyle w:val="Corpodetexto"/>
+        <w:spacing w:line="278" w:lineRule="auto"/>
+        <w:ind w:left="0" w:firstLine="720"/>
+        <w:jc w:val="both"/>
+      </w:pPr>
+      <w:r>
+        <w:t xml:space="preserve">Desenvolver um website com formulário de cadastro, tematizado com algo que represente o autor do projeto, utilizando todos os conteúdos aprendidos nas disciplinas de aula, isso inclui Tecnologia da Informação, com documentações e planejamentos; Banco de Dados, usando o Modelo lógico e relacionamentos; </w:t>
+      </w:r>
+      <w:proofErr w:type="gramStart"/>
+      <w:r>
+        <w:t>Variáveis</w:t>
+      </w:r>
+      <w:proofErr w:type="gramEnd"/>
+      <w:r>
+        <w:t>, funções e operações aprendidas em Algoritmos e Arquitetura Computacional; utilização de uma VM; conceitos de contexto, dashboards e indicadores apresentados em Pesquisa e Inovação. Também será necessário aplicar os conceitos trabalhados nas aulas de Socioemocional. Resultando assim em um projeto integrador com diversos conceitos diferentes sendo aplicados de forma a se complementarem e transmitir o nível de conhecimento aprendido.</w:t>
       </w:r>
     </w:p>
     <w:p>
@@ -682,10 +781,205 @@
         <w:t>Limites e Exclusões:</w:t>
       </w:r>
       <w:r>
-        <w:t xml:space="preserve"> Não deve ser realizado o uso de quaisquer fontes externas e ajuda de terceiros, não fazer o uso de conceitos que não foram apresentados em aula, nem compartilhar os códigos entre os colegas de classe. As funcionalidades do website serão institucionais e não apresentará funções avançadas que ainda nã</w:t>
+        <w:t xml:space="preserve"> </w:t>
+      </w:r>
+    </w:p>
+    <w:p>
+      <w:pPr>
+        <w:pStyle w:val="Corpodetexto"/>
+        <w:spacing w:line="278" w:lineRule="auto"/>
+        <w:ind w:left="0" w:firstLine="720"/>
+        <w:jc w:val="both"/>
+      </w:pPr>
+      <w:r>
+        <w:t>Não deve ser realizado o uso de quaisquer fontes externas e ajuda de terceiros, não fazer o uso de conceitos que não foram apresentados em aula, nem compartilhar os códigos entre os colegas de classe. As funcionalidades do website serão institucionais e não apresentará funções avançadas que ainda nã</w:t>
       </w:r>
       <w:r>
         <w:t>o foram expostas em aula.</w:t>
+      </w:r>
+    </w:p>
+    <w:p>
+      <w:pPr>
+        <w:pStyle w:val="Corpodetexto"/>
+        <w:spacing w:line="278" w:lineRule="auto"/>
+        <w:ind w:left="0"/>
+        <w:jc w:val="both"/>
+      </w:pPr>
+    </w:p>
+    <w:p>
+      <w:pPr>
+        <w:pStyle w:val="Corpodetexto"/>
+        <w:spacing w:line="278" w:lineRule="auto"/>
+        <w:ind w:left="0"/>
+        <w:jc w:val="both"/>
+      </w:pPr>
+    </w:p>
+    <w:p>
+      <w:pPr>
+        <w:pStyle w:val="Corpodetexto"/>
+        <w:spacing w:line="278" w:lineRule="auto"/>
+        <w:jc w:val="both"/>
+        <w:rPr>
+          <w:b/>
+          <w:bCs/>
+        </w:rPr>
+      </w:pPr>
+      <w:r>
+        <w:rPr>
+          <w:b/>
+          <w:bCs/>
+        </w:rPr>
+        <w:t xml:space="preserve">Dificuldades/Superações: </w:t>
+      </w:r>
+    </w:p>
+    <w:p>
+      <w:pPr>
+        <w:pStyle w:val="Corpodetexto"/>
+        <w:spacing w:line="278" w:lineRule="auto"/>
+        <w:ind w:firstLine="697"/>
+        <w:jc w:val="both"/>
+      </w:pPr>
+      <w:r>
+        <w:t>Me encontrei perdido em meio ao desafio de desenvolver o projeto inteiramente sozinho e explorar a API para realização</w:t>
+      </w:r>
+      <w:r>
+        <w:t xml:space="preserve">, essas partes técnicas demandaram diversos estudos da ferramenta disponibilizada para a aplicação dela. </w:t>
+      </w:r>
+      <w:r>
+        <w:t>Em meio as necessidades de mudança no projeto em Grupo,</w:t>
+      </w:r>
+      <w:r>
+        <w:t xml:space="preserve"> foi difícil a conciliação entre os projetos que resultaram</w:t>
+      </w:r>
+      <w:r>
+        <w:t xml:space="preserve"> </w:t>
+      </w:r>
+      <w:r>
+        <w:t xml:space="preserve">em </w:t>
+      </w:r>
+      <w:r>
+        <w:t xml:space="preserve">tarefas </w:t>
+      </w:r>
+      <w:r>
+        <w:t>acumuladas e a preocupação com os prazos. Surgiu a necessidade de se programar com rotinas de estudos e alternar entre tarefas necessárias para o grupo, sem deixar com que isso afetasse o desenvolvimento do individual.</w:t>
+      </w:r>
+    </w:p>
+    <w:p>
+      <w:pPr>
+        <w:pStyle w:val="Corpodetexto"/>
+        <w:spacing w:line="278" w:lineRule="auto"/>
+        <w:ind w:left="0"/>
+        <w:jc w:val="both"/>
+      </w:pPr>
+    </w:p>
+    <w:p>
+      <w:pPr>
+        <w:pStyle w:val="Corpodetexto"/>
+        <w:spacing w:line="278" w:lineRule="auto"/>
+        <w:ind w:left="0"/>
+        <w:jc w:val="both"/>
+      </w:pPr>
+    </w:p>
+    <w:p>
+      <w:pPr>
+        <w:pStyle w:val="Corpodetexto"/>
+        <w:spacing w:line="278" w:lineRule="auto"/>
+        <w:ind w:left="0"/>
+        <w:jc w:val="both"/>
+        <w:rPr>
+          <w:b/>
+          <w:bCs/>
+        </w:rPr>
+      </w:pPr>
+      <w:r>
+        <w:rPr>
+          <w:b/>
+          <w:bCs/>
+        </w:rPr>
+        <w:t xml:space="preserve">ODS 16 – Paz, Justiça e Instituições Eficazes: </w:t>
+      </w:r>
+    </w:p>
+    <w:p>
+      <w:pPr>
+        <w:pStyle w:val="Corpodetexto"/>
+        <w:spacing w:line="278" w:lineRule="auto"/>
+        <w:ind w:left="0"/>
+        <w:jc w:val="both"/>
+      </w:pPr>
+      <w:r>
+        <w:rPr>
+          <w:b/>
+          <w:bCs/>
+        </w:rPr>
+        <w:t xml:space="preserve"> </w:t>
+      </w:r>
+      <w:r>
+        <w:tab/>
+      </w:r>
+      <w:r>
+        <w:t xml:space="preserve">Esse objetivo estabelecido pela ONU preza por práticas sustentáveis pacíficas e inclusivas, diz relação a conceitos sobre justiça para todos e instituições que contribuam responsavelmente para a sociedade. Vendo mais sobre esse objetivo, percebi a grande relação dele com os temas abordados no anime de </w:t>
+      </w:r>
+      <w:proofErr w:type="spellStart"/>
+      <w:r>
+        <w:t>One</w:t>
+      </w:r>
+      <w:proofErr w:type="spellEnd"/>
+      <w:r>
+        <w:t xml:space="preserve"> </w:t>
+      </w:r>
+      <w:proofErr w:type="spellStart"/>
+      <w:r>
+        <w:t>Piece</w:t>
+      </w:r>
+      <w:proofErr w:type="spellEnd"/>
+      <w:r>
+        <w:t xml:space="preserve">, onde o Luffy é o protagonista e desenvolve diversas cenas que reforçam uma busca da liberdade e intolerância a injustiças. </w:t>
+      </w:r>
+    </w:p>
+    <w:p>
+      <w:pPr>
+        <w:pStyle w:val="Corpodetexto"/>
+        <w:spacing w:line="278" w:lineRule="auto"/>
+        <w:ind w:left="0"/>
+        <w:jc w:val="both"/>
+      </w:pPr>
+    </w:p>
+    <w:p>
+      <w:pPr>
+        <w:pStyle w:val="Corpodetexto"/>
+        <w:spacing w:line="278" w:lineRule="auto"/>
+        <w:ind w:left="0"/>
+        <w:jc w:val="both"/>
+        <w:rPr>
+          <w:b/>
+          <w:bCs/>
+        </w:rPr>
+      </w:pPr>
+      <w:r>
+        <w:rPr>
+          <w:b/>
+          <w:bCs/>
+        </w:rPr>
+        <w:t>Outras ODS</w:t>
+      </w:r>
+      <w:r>
+        <w:rPr>
+          <w:b/>
+          <w:bCs/>
+        </w:rPr>
+        <w:t xml:space="preserve">: </w:t>
+      </w:r>
+    </w:p>
+    <w:p>
+      <w:pPr>
+        <w:pStyle w:val="Corpodetexto"/>
+        <w:spacing w:line="278" w:lineRule="auto"/>
+        <w:ind w:left="0"/>
+        <w:jc w:val="both"/>
+      </w:pPr>
+      <w:r>
+        <w:tab/>
+        <w:t xml:space="preserve">Além do objetivo citado anteriormente, a história abrange outros cenários que podem ser facilmente visualizados no mundo real. Temas que abrangem a desigualdade social, de gênero, pobreza, fome e etc. </w:t>
       </w:r>
     </w:p>
     <w:p>
@@ -1142,6 +1436,7 @@
   <w:style w:type="character" w:default="1" w:styleId="Fontepargpadro">
     <w:name w:val="Default Paragraph Font"/>
     <w:uiPriority w:val="1"/>
+    <w:semiHidden/>
     <w:unhideWhenUsed/>
   </w:style>
   <w:style w:type="table" w:default="1" w:styleId="Tabelanormal">

</xml_diff>